<commit_message>
Se reparan los word para que este pueda ser dinamico dependiendo de tipo de persona y cual empresa
</commit_message>
<xml_diff>
--- a/back/src/static/todoSilver/AUTORIZACIÓN EXPRESA PARA EL TRATAMIENTO DE DATOS PERSONALES.docx
+++ b/back/src/static/todoSilver/AUTORIZACIÓN EXPRESA PARA EL TRATAMIENTO DE DATOS PERSONALES.docx
@@ -1,6 +1,6 @@
 
 <file path=word/document.xml><?xml version="1.0" encoding="utf-8"?>
-<w:document xmlns:wpc="http://schemas.microsoft.com/office/word/2010/wordprocessingCanvas" xmlns:cx="http://schemas.microsoft.com/office/drawing/2014/chartex" xmlns:cx1="http://schemas.microsoft.com/office/drawing/2015/9/8/chartex" xmlns:cx2="http://schemas.microsoft.com/office/drawing/2015/10/21/chartex" xmlns:cx3="http://schemas.microsoft.com/office/drawing/2016/5/9/chartex" xmlns:cx4="http://schemas.microsoft.com/office/drawing/2016/5/10/chartex" xmlns:cx5="http://schemas.microsoft.com/office/drawing/2016/5/11/chartex" xmlns:cx6="http://schemas.microsoft.com/office/drawing/2016/5/12/chartex" xmlns:cx7="http://schemas.microsoft.com/office/drawing/2016/5/13/chartex" xmlns:cx8="http://schemas.microsoft.com/office/drawing/2016/5/14/chartex" xmlns:mc="http://schemas.openxmlformats.org/markup-compatibility/2006" xmlns:aink="http://schemas.microsoft.com/office/drawing/2016/ink" xmlns:am3d="http://schemas.microsoft.com/office/drawing/2017/model3d" xmlns:o="urn:schemas-microsoft-com:office:office" xmlns:oel="http://schemas.microsoft.com/office/2019/extlst" xmlns:r="http://schemas.openxmlformats.org/officeDocument/2006/relationships" xmlns:m="http://schemas.openxmlformats.org/officeDocument/2006/math" xmlns:v="urn:schemas-microsoft-com:vml" xmlns:wp14="http://schemas.microsoft.com/office/word/2010/wordprocessingDrawing" xmlns:wp="http://schemas.openxmlformats.org/drawingml/2006/wordprocessingDrawing" xmlns:w10="urn:schemas-microsoft-com:office:word" xmlns:w="http://schemas.openxmlformats.org/wordprocessingml/2006/main" xmlns:w14="http://schemas.microsoft.com/office/word/2010/wordml" xmlns:w15="http://schemas.microsoft.com/office/word/2012/wordml" xmlns:w16cex="http://schemas.microsoft.com/office/word/2018/wordml/cex" xmlns:w16cid="http://schemas.microsoft.com/office/word/2016/wordml/cid" xmlns:w16="http://schemas.microsoft.com/office/word/2018/wordml" xmlns:w16du="http://schemas.microsoft.com/office/word/2023/wordml/word16du" xmlns:w16sdtdh="http://schemas.microsoft.com/office/word/2020/wordml/sdtdatahash" xmlns:w16sdtfl="http://schemas.microsoft.com/office/word/2024/wordml/sdtformatlock" xmlns:w16se="http://schemas.microsoft.com/office/word/2015/wordml/symex" xmlns:wpg="http://schemas.microsoft.com/office/word/2010/wordprocessingGroup" xmlns:wpi="http://schemas.microsoft.com/office/word/2010/wordprocessingInk" xmlns:wne="http://schemas.microsoft.com/office/word/2006/wordml" xmlns:wps="http://schemas.microsoft.com/office/word/2010/wordprocessingShape" mc:Ignorable="w14 w15 w16se w16cid w16 w16cex w16sdtdh w16sdtfl w16du wp14">
+<w:document xmlns:wpc="http://schemas.microsoft.com/office/word/2010/wordprocessingCanvas" xmlns:cx="http://schemas.microsoft.com/office/drawing/2014/chartex" xmlns:cx1="http://schemas.microsoft.com/office/drawing/2015/9/8/chartex" xmlns:cx2="http://schemas.microsoft.com/office/drawing/2015/10/21/chartex" xmlns:cx3="http://schemas.microsoft.com/office/drawing/2016/5/9/chartex" xmlns:cx4="http://schemas.microsoft.com/office/drawing/2016/5/10/chartex" xmlns:cx5="http://schemas.microsoft.com/office/drawing/2016/5/11/chartex" xmlns:cx6="http://schemas.microsoft.com/office/drawing/2016/5/12/chartex" xmlns:cx7="http://schemas.microsoft.com/office/drawing/2016/5/13/chartex" xmlns:cx8="http://schemas.microsoft.com/office/drawing/2016/5/14/chartex" xmlns:mc="http://schemas.openxmlformats.org/markup-compatibility/2006" xmlns:aink="http://schemas.microsoft.com/office/drawing/2016/ink" xmlns:am3d="http://schemas.microsoft.com/office/drawing/2017/model3d" xmlns:o="urn:schemas-microsoft-com:office:office" xmlns:oel="http://schemas.microsoft.com/office/2019/extlst" xmlns:r="http://schemas.openxmlformats.org/officeDocument/2006/relationships" xmlns:m="http://schemas.openxmlformats.org/officeDocument/2006/math" xmlns:v="urn:schemas-microsoft-com:vml" xmlns:wp14="http://schemas.microsoft.com/office/word/2010/wordprocessingDrawing" xmlns:wp="http://schemas.openxmlformats.org/drawingml/2006/wordprocessingDrawing" xmlns:w10="urn:schemas-microsoft-com:office:word" xmlns:w="http://schemas.openxmlformats.org/wordprocessingml/2006/main" xmlns:w14="http://schemas.microsoft.com/office/word/2010/wordml" xmlns:w15="http://schemas.microsoft.com/office/word/2012/wordml" xmlns:w16cei="http://schemas.microsoft.com/office/word/2026/wordml/cei" xmlns:w16cex="http://schemas.microsoft.com/office/word/2018/wordml/cex" xmlns:w16cid="http://schemas.microsoft.com/office/word/2016/wordml/cid" xmlns:w16="http://schemas.microsoft.com/office/word/2018/wordml" xmlns:w16du="http://schemas.microsoft.com/office/word/2023/wordml/word16du" xmlns:w16sdtdh="http://schemas.microsoft.com/office/word/2020/wordml/sdtdatahash" xmlns:w16sdtfl="http://schemas.microsoft.com/office/word/2024/wordml/sdtformatlock" xmlns:w16se="http://schemas.microsoft.com/office/word/2015/wordml/symex" xmlns:wpg="http://schemas.microsoft.com/office/word/2010/wordprocessingGroup" xmlns:wpi="http://schemas.microsoft.com/office/word/2010/wordprocessingInk" xmlns:wne="http://schemas.microsoft.com/office/word/2006/wordml" xmlns:wps="http://schemas.microsoft.com/office/word/2010/wordprocessingShape" mc:Ignorable="w14 w15 w16se w16cid w16 w16cex w16sdtdh w16sdtfl w16du wp14">
   <w:body>
     <w:p>
       <w:pPr>
@@ -1181,7 +1181,7 @@
           <w:b/>
           <w:bCs/>
         </w:rPr>
-        <w:t>NombreCompleto</w:t>
+        <w:t>ContratistaFirmaNombre</w:t>
       </w:r>
       <w:proofErr w:type="spellEnd"/>
       <w:r>
@@ -1225,25 +1225,7 @@
           <w:b/>
           <w:bCs/>
         </w:rPr>
-        <w:t>TipoDocumento</w:t>
-      </w:r>
-      <w:proofErr w:type="spellEnd"/>
-      <w:r>
-        <w:rPr>
-          <w:rFonts w:eastAsia="Arial"/>
-          <w:b/>
-          <w:bCs/>
-        </w:rPr>
-        <w:t>}} No. {{</w:t>
-      </w:r>
-      <w:proofErr w:type="spellStart"/>
-      <w:r>
-        <w:rPr>
-          <w:rFonts w:eastAsia="Arial"/>
-          <w:b/>
-          <w:bCs/>
-        </w:rPr>
-        <w:t>NumeroDocumento</w:t>
+        <w:t>ContratistaFirmaDocumento</w:t>
       </w:r>
       <w:proofErr w:type="spellEnd"/>
       <w:r>
@@ -1315,7 +1297,7 @@
 </file>
 
 <file path=word/endnotes.xml><?xml version="1.0" encoding="utf-8"?>
-<w:endnotes xmlns:wpc="http://schemas.microsoft.com/office/word/2010/wordprocessingCanvas" xmlns:cx="http://schemas.microsoft.com/office/drawing/2014/chartex" xmlns:cx1="http://schemas.microsoft.com/office/drawing/2015/9/8/chartex" xmlns:cx2="http://schemas.microsoft.com/office/drawing/2015/10/21/chartex" xmlns:cx3="http://schemas.microsoft.com/office/drawing/2016/5/9/chartex" xmlns:cx4="http://schemas.microsoft.com/office/drawing/2016/5/10/chartex" xmlns:cx5="http://schemas.microsoft.com/office/drawing/2016/5/11/chartex" xmlns:cx6="http://schemas.microsoft.com/office/drawing/2016/5/12/chartex" xmlns:cx7="http://schemas.microsoft.com/office/drawing/2016/5/13/chartex" xmlns:cx8="http://schemas.microsoft.com/office/drawing/2016/5/14/chartex" xmlns:mc="http://schemas.openxmlformats.org/markup-compatibility/2006" xmlns:aink="http://schemas.microsoft.com/office/drawing/2016/ink" xmlns:am3d="http://schemas.microsoft.com/office/drawing/2017/model3d" xmlns:o="urn:schemas-microsoft-com:office:office" xmlns:oel="http://schemas.microsoft.com/office/2019/extlst" xmlns:r="http://schemas.openxmlformats.org/officeDocument/2006/relationships" xmlns:m="http://schemas.openxmlformats.org/officeDocument/2006/math" xmlns:v="urn:schemas-microsoft-com:vml" xmlns:wp14="http://schemas.microsoft.com/office/word/2010/wordprocessingDrawing" xmlns:wp="http://schemas.openxmlformats.org/drawingml/2006/wordprocessingDrawing" xmlns:w10="urn:schemas-microsoft-com:office:word" xmlns:w="http://schemas.openxmlformats.org/wordprocessingml/2006/main" xmlns:w14="http://schemas.microsoft.com/office/word/2010/wordml" xmlns:w15="http://schemas.microsoft.com/office/word/2012/wordml" xmlns:w16cex="http://schemas.microsoft.com/office/word/2018/wordml/cex" xmlns:w16cid="http://schemas.microsoft.com/office/word/2016/wordml/cid" xmlns:w16="http://schemas.microsoft.com/office/word/2018/wordml" xmlns:w16du="http://schemas.microsoft.com/office/word/2023/wordml/word16du" xmlns:w16sdtdh="http://schemas.microsoft.com/office/word/2020/wordml/sdtdatahash" xmlns:w16sdtfl="http://schemas.microsoft.com/office/word/2024/wordml/sdtformatlock" xmlns:w16se="http://schemas.microsoft.com/office/word/2015/wordml/symex" xmlns:wpg="http://schemas.microsoft.com/office/word/2010/wordprocessingGroup" xmlns:wpi="http://schemas.microsoft.com/office/word/2010/wordprocessingInk" xmlns:wne="http://schemas.microsoft.com/office/word/2006/wordml" xmlns:wps="http://schemas.microsoft.com/office/word/2010/wordprocessingShape" mc:Ignorable="w14 w15 w16se w16cid w16 w16cex w16sdtdh w16sdtfl w16du wp14">
+<w:endnotes xmlns:wpc="http://schemas.microsoft.com/office/word/2010/wordprocessingCanvas" xmlns:cx="http://schemas.microsoft.com/office/drawing/2014/chartex" xmlns:cx1="http://schemas.microsoft.com/office/drawing/2015/9/8/chartex" xmlns:cx2="http://schemas.microsoft.com/office/drawing/2015/10/21/chartex" xmlns:cx3="http://schemas.microsoft.com/office/drawing/2016/5/9/chartex" xmlns:cx4="http://schemas.microsoft.com/office/drawing/2016/5/10/chartex" xmlns:cx5="http://schemas.microsoft.com/office/drawing/2016/5/11/chartex" xmlns:cx6="http://schemas.microsoft.com/office/drawing/2016/5/12/chartex" xmlns:cx7="http://schemas.microsoft.com/office/drawing/2016/5/13/chartex" xmlns:cx8="http://schemas.microsoft.com/office/drawing/2016/5/14/chartex" xmlns:mc="http://schemas.openxmlformats.org/markup-compatibility/2006" xmlns:aink="http://schemas.microsoft.com/office/drawing/2016/ink" xmlns:am3d="http://schemas.microsoft.com/office/drawing/2017/model3d" xmlns:o="urn:schemas-microsoft-com:office:office" xmlns:oel="http://schemas.microsoft.com/office/2019/extlst" xmlns:r="http://schemas.openxmlformats.org/officeDocument/2006/relationships" xmlns:m="http://schemas.openxmlformats.org/officeDocument/2006/math" xmlns:v="urn:schemas-microsoft-com:vml" xmlns:wp14="http://schemas.microsoft.com/office/word/2010/wordprocessingDrawing" xmlns:wp="http://schemas.openxmlformats.org/drawingml/2006/wordprocessingDrawing" xmlns:w10="urn:schemas-microsoft-com:office:word" xmlns:w="http://schemas.openxmlformats.org/wordprocessingml/2006/main" xmlns:w14="http://schemas.microsoft.com/office/word/2010/wordml" xmlns:w15="http://schemas.microsoft.com/office/word/2012/wordml" xmlns:w16cei="http://schemas.microsoft.com/office/word/2026/wordml/cei" xmlns:w16cex="http://schemas.microsoft.com/office/word/2018/wordml/cex" xmlns:w16cid="http://schemas.microsoft.com/office/word/2016/wordml/cid" xmlns:w16="http://schemas.microsoft.com/office/word/2018/wordml" xmlns:w16du="http://schemas.microsoft.com/office/word/2023/wordml/word16du" xmlns:w16sdtdh="http://schemas.microsoft.com/office/word/2020/wordml/sdtdatahash" xmlns:w16sdtfl="http://schemas.microsoft.com/office/word/2024/wordml/sdtformatlock" xmlns:w16se="http://schemas.microsoft.com/office/word/2015/wordml/symex" xmlns:wpg="http://schemas.microsoft.com/office/word/2010/wordprocessingGroup" xmlns:wpi="http://schemas.microsoft.com/office/word/2010/wordprocessingInk" xmlns:wne="http://schemas.microsoft.com/office/word/2006/wordml" xmlns:wps="http://schemas.microsoft.com/office/word/2010/wordprocessingShape" mc:Ignorable="w14 w15 w16se w16cid w16 w16cex w16sdtdh w16sdtfl w16du wp14">
   <w:endnote w:type="separator" w:id="-1">
     <w:p>
       <w:pPr>
@@ -1347,7 +1329,7 @@
 </file>
 
 <file path=word/footer1.xml><?xml version="1.0" encoding="utf-8"?>
-<w:ftr xmlns:wpc="http://schemas.microsoft.com/office/word/2010/wordprocessingCanvas" xmlns:cx="http://schemas.microsoft.com/office/drawing/2014/chartex" xmlns:cx1="http://schemas.microsoft.com/office/drawing/2015/9/8/chartex" xmlns:cx2="http://schemas.microsoft.com/office/drawing/2015/10/21/chartex" xmlns:cx3="http://schemas.microsoft.com/office/drawing/2016/5/9/chartex" xmlns:cx4="http://schemas.microsoft.com/office/drawing/2016/5/10/chartex" xmlns:cx5="http://schemas.microsoft.com/office/drawing/2016/5/11/chartex" xmlns:cx6="http://schemas.microsoft.com/office/drawing/2016/5/12/chartex" xmlns:cx7="http://schemas.microsoft.com/office/drawing/2016/5/13/chartex" xmlns:cx8="http://schemas.microsoft.com/office/drawing/2016/5/14/chartex" xmlns:mc="http://schemas.openxmlformats.org/markup-compatibility/2006" xmlns:aink="http://schemas.microsoft.com/office/drawing/2016/ink" xmlns:am3d="http://schemas.microsoft.com/office/drawing/2017/model3d" xmlns:o="urn:schemas-microsoft-com:office:office" xmlns:oel="http://schemas.microsoft.com/office/2019/extlst" xmlns:r="http://schemas.openxmlformats.org/officeDocument/2006/relationships" xmlns:m="http://schemas.openxmlformats.org/officeDocument/2006/math" xmlns:v="urn:schemas-microsoft-com:vml" xmlns:wp14="http://schemas.microsoft.com/office/word/2010/wordprocessingDrawing" xmlns:wp="http://schemas.openxmlformats.org/drawingml/2006/wordprocessingDrawing" xmlns:w10="urn:schemas-microsoft-com:office:word" xmlns:w="http://schemas.openxmlformats.org/wordprocessingml/2006/main" xmlns:w14="http://schemas.microsoft.com/office/word/2010/wordml" xmlns:w15="http://schemas.microsoft.com/office/word/2012/wordml" xmlns:w16cex="http://schemas.microsoft.com/office/word/2018/wordml/cex" xmlns:w16cid="http://schemas.microsoft.com/office/word/2016/wordml/cid" xmlns:w16="http://schemas.microsoft.com/office/word/2018/wordml" xmlns:w16du="http://schemas.microsoft.com/office/word/2023/wordml/word16du" xmlns:w16sdtdh="http://schemas.microsoft.com/office/word/2020/wordml/sdtdatahash" xmlns:w16sdtfl="http://schemas.microsoft.com/office/word/2024/wordml/sdtformatlock" xmlns:w16se="http://schemas.microsoft.com/office/word/2015/wordml/symex" xmlns:wpg="http://schemas.microsoft.com/office/word/2010/wordprocessingGroup" xmlns:wpi="http://schemas.microsoft.com/office/word/2010/wordprocessingInk" xmlns:wne="http://schemas.microsoft.com/office/word/2006/wordml" xmlns:wps="http://schemas.microsoft.com/office/word/2010/wordprocessingShape" mc:Ignorable="w14 w15 w16se w16cid w16 w16cex w16sdtdh w16sdtfl w16du wp14">
+<w:ftr xmlns:wpc="http://schemas.microsoft.com/office/word/2010/wordprocessingCanvas" xmlns:cx="http://schemas.microsoft.com/office/drawing/2014/chartex" xmlns:cx1="http://schemas.microsoft.com/office/drawing/2015/9/8/chartex" xmlns:cx2="http://schemas.microsoft.com/office/drawing/2015/10/21/chartex" xmlns:cx3="http://schemas.microsoft.com/office/drawing/2016/5/9/chartex" xmlns:cx4="http://schemas.microsoft.com/office/drawing/2016/5/10/chartex" xmlns:cx5="http://schemas.microsoft.com/office/drawing/2016/5/11/chartex" xmlns:cx6="http://schemas.microsoft.com/office/drawing/2016/5/12/chartex" xmlns:cx7="http://schemas.microsoft.com/office/drawing/2016/5/13/chartex" xmlns:cx8="http://schemas.microsoft.com/office/drawing/2016/5/14/chartex" xmlns:mc="http://schemas.openxmlformats.org/markup-compatibility/2006" xmlns:aink="http://schemas.microsoft.com/office/drawing/2016/ink" xmlns:am3d="http://schemas.microsoft.com/office/drawing/2017/model3d" xmlns:o="urn:schemas-microsoft-com:office:office" xmlns:oel="http://schemas.microsoft.com/office/2019/extlst" xmlns:r="http://schemas.openxmlformats.org/officeDocument/2006/relationships" xmlns:m="http://schemas.openxmlformats.org/officeDocument/2006/math" xmlns:v="urn:schemas-microsoft-com:vml" xmlns:wp14="http://schemas.microsoft.com/office/word/2010/wordprocessingDrawing" xmlns:wp="http://schemas.openxmlformats.org/drawingml/2006/wordprocessingDrawing" xmlns:w10="urn:schemas-microsoft-com:office:word" xmlns:w="http://schemas.openxmlformats.org/wordprocessingml/2006/main" xmlns:w14="http://schemas.microsoft.com/office/word/2010/wordml" xmlns:w15="http://schemas.microsoft.com/office/word/2012/wordml" xmlns:w16cei="http://schemas.microsoft.com/office/word/2026/wordml/cei" xmlns:w16cex="http://schemas.microsoft.com/office/word/2018/wordml/cex" xmlns:w16cid="http://schemas.microsoft.com/office/word/2016/wordml/cid" xmlns:w16="http://schemas.microsoft.com/office/word/2018/wordml" xmlns:w16du="http://schemas.microsoft.com/office/word/2023/wordml/word16du" xmlns:w16sdtdh="http://schemas.microsoft.com/office/word/2020/wordml/sdtdatahash" xmlns:w16sdtfl="http://schemas.microsoft.com/office/word/2024/wordml/sdtformatlock" xmlns:w16se="http://schemas.microsoft.com/office/word/2015/wordml/symex" xmlns:wpg="http://schemas.microsoft.com/office/word/2010/wordprocessingGroup" xmlns:wpi="http://schemas.microsoft.com/office/word/2010/wordprocessingInk" xmlns:wne="http://schemas.microsoft.com/office/word/2006/wordml" xmlns:wps="http://schemas.microsoft.com/office/word/2010/wordprocessingShape" mc:Ignorable="w14 w15 w16se w16cid w16 w16cex w16sdtdh w16sdtfl w16du wp14">
   <w:p>
     <w:pPr>
       <w:pBdr>
@@ -1371,7 +1353,7 @@
 </file>
 
 <file path=word/footer2.xml><?xml version="1.0" encoding="utf-8"?>
-<w:ftr xmlns:wpc="http://schemas.microsoft.com/office/word/2010/wordprocessingCanvas" xmlns:cx="http://schemas.microsoft.com/office/drawing/2014/chartex" xmlns:cx1="http://schemas.microsoft.com/office/drawing/2015/9/8/chartex" xmlns:cx2="http://schemas.microsoft.com/office/drawing/2015/10/21/chartex" xmlns:cx3="http://schemas.microsoft.com/office/drawing/2016/5/9/chartex" xmlns:cx4="http://schemas.microsoft.com/office/drawing/2016/5/10/chartex" xmlns:cx5="http://schemas.microsoft.com/office/drawing/2016/5/11/chartex" xmlns:cx6="http://schemas.microsoft.com/office/drawing/2016/5/12/chartex" xmlns:cx7="http://schemas.microsoft.com/office/drawing/2016/5/13/chartex" xmlns:cx8="http://schemas.microsoft.com/office/drawing/2016/5/14/chartex" xmlns:mc="http://schemas.openxmlformats.org/markup-compatibility/2006" xmlns:aink="http://schemas.microsoft.com/office/drawing/2016/ink" xmlns:am3d="http://schemas.microsoft.com/office/drawing/2017/model3d" xmlns:o="urn:schemas-microsoft-com:office:office" xmlns:oel="http://schemas.microsoft.com/office/2019/extlst" xmlns:r="http://schemas.openxmlformats.org/officeDocument/2006/relationships" xmlns:m="http://schemas.openxmlformats.org/officeDocument/2006/math" xmlns:v="urn:schemas-microsoft-com:vml" xmlns:wp14="http://schemas.microsoft.com/office/word/2010/wordprocessingDrawing" xmlns:wp="http://schemas.openxmlformats.org/drawingml/2006/wordprocessingDrawing" xmlns:w10="urn:schemas-microsoft-com:office:word" xmlns:w="http://schemas.openxmlformats.org/wordprocessingml/2006/main" xmlns:w14="http://schemas.microsoft.com/office/word/2010/wordml" xmlns:w15="http://schemas.microsoft.com/office/word/2012/wordml" xmlns:w16cex="http://schemas.microsoft.com/office/word/2018/wordml/cex" xmlns:w16cid="http://schemas.microsoft.com/office/word/2016/wordml/cid" xmlns:w16="http://schemas.microsoft.com/office/word/2018/wordml" xmlns:w16du="http://schemas.microsoft.com/office/word/2023/wordml/word16du" xmlns:w16sdtdh="http://schemas.microsoft.com/office/word/2020/wordml/sdtdatahash" xmlns:w16sdtfl="http://schemas.microsoft.com/office/word/2024/wordml/sdtformatlock" xmlns:w16se="http://schemas.microsoft.com/office/word/2015/wordml/symex" xmlns:wpg="http://schemas.microsoft.com/office/word/2010/wordprocessingGroup" xmlns:wpi="http://schemas.microsoft.com/office/word/2010/wordprocessingInk" xmlns:wne="http://schemas.microsoft.com/office/word/2006/wordml" xmlns:wps="http://schemas.microsoft.com/office/word/2010/wordprocessingShape" mc:Ignorable="w14 w15 w16se w16cid w16 w16cex w16sdtdh w16sdtfl w16du wp14">
+<w:ftr xmlns:wpc="http://schemas.microsoft.com/office/word/2010/wordprocessingCanvas" xmlns:cx="http://schemas.microsoft.com/office/drawing/2014/chartex" xmlns:cx1="http://schemas.microsoft.com/office/drawing/2015/9/8/chartex" xmlns:cx2="http://schemas.microsoft.com/office/drawing/2015/10/21/chartex" xmlns:cx3="http://schemas.microsoft.com/office/drawing/2016/5/9/chartex" xmlns:cx4="http://schemas.microsoft.com/office/drawing/2016/5/10/chartex" xmlns:cx5="http://schemas.microsoft.com/office/drawing/2016/5/11/chartex" xmlns:cx6="http://schemas.microsoft.com/office/drawing/2016/5/12/chartex" xmlns:cx7="http://schemas.microsoft.com/office/drawing/2016/5/13/chartex" xmlns:cx8="http://schemas.microsoft.com/office/drawing/2016/5/14/chartex" xmlns:mc="http://schemas.openxmlformats.org/markup-compatibility/2006" xmlns:aink="http://schemas.microsoft.com/office/drawing/2016/ink" xmlns:am3d="http://schemas.microsoft.com/office/drawing/2017/model3d" xmlns:o="urn:schemas-microsoft-com:office:office" xmlns:oel="http://schemas.microsoft.com/office/2019/extlst" xmlns:r="http://schemas.openxmlformats.org/officeDocument/2006/relationships" xmlns:m="http://schemas.openxmlformats.org/officeDocument/2006/math" xmlns:v="urn:schemas-microsoft-com:vml" xmlns:wp14="http://schemas.microsoft.com/office/word/2010/wordprocessingDrawing" xmlns:wp="http://schemas.openxmlformats.org/drawingml/2006/wordprocessingDrawing" xmlns:w10="urn:schemas-microsoft-com:office:word" xmlns:w="http://schemas.openxmlformats.org/wordprocessingml/2006/main" xmlns:w14="http://schemas.microsoft.com/office/word/2010/wordml" xmlns:w15="http://schemas.microsoft.com/office/word/2012/wordml" xmlns:w16cei="http://schemas.microsoft.com/office/word/2026/wordml/cei" xmlns:w16cex="http://schemas.microsoft.com/office/word/2018/wordml/cex" xmlns:w16cid="http://schemas.microsoft.com/office/word/2016/wordml/cid" xmlns:w16="http://schemas.microsoft.com/office/word/2018/wordml" xmlns:w16du="http://schemas.microsoft.com/office/word/2023/wordml/word16du" xmlns:w16sdtdh="http://schemas.microsoft.com/office/word/2020/wordml/sdtdatahash" xmlns:w16sdtfl="http://schemas.microsoft.com/office/word/2024/wordml/sdtformatlock" xmlns:w16se="http://schemas.microsoft.com/office/word/2015/wordml/symex" xmlns:wpg="http://schemas.microsoft.com/office/word/2010/wordprocessingGroup" xmlns:wpi="http://schemas.microsoft.com/office/word/2010/wordprocessingInk" xmlns:wne="http://schemas.microsoft.com/office/word/2006/wordml" xmlns:wps="http://schemas.microsoft.com/office/word/2010/wordprocessingShape" mc:Ignorable="w14 w15 w16se w16cid w16 w16cex w16sdtdh w16sdtfl w16du wp14">
   <w:p>
     <w:pPr>
       <w:pBdr>
@@ -1517,7 +1499,7 @@
 </file>
 
 <file path=word/footer3.xml><?xml version="1.0" encoding="utf-8"?>
-<w:ftr xmlns:wpc="http://schemas.microsoft.com/office/word/2010/wordprocessingCanvas" xmlns:cx="http://schemas.microsoft.com/office/drawing/2014/chartex" xmlns:cx1="http://schemas.microsoft.com/office/drawing/2015/9/8/chartex" xmlns:cx2="http://schemas.microsoft.com/office/drawing/2015/10/21/chartex" xmlns:cx3="http://schemas.microsoft.com/office/drawing/2016/5/9/chartex" xmlns:cx4="http://schemas.microsoft.com/office/drawing/2016/5/10/chartex" xmlns:cx5="http://schemas.microsoft.com/office/drawing/2016/5/11/chartex" xmlns:cx6="http://schemas.microsoft.com/office/drawing/2016/5/12/chartex" xmlns:cx7="http://schemas.microsoft.com/office/drawing/2016/5/13/chartex" xmlns:cx8="http://schemas.microsoft.com/office/drawing/2016/5/14/chartex" xmlns:mc="http://schemas.openxmlformats.org/markup-compatibility/2006" xmlns:aink="http://schemas.microsoft.com/office/drawing/2016/ink" xmlns:am3d="http://schemas.microsoft.com/office/drawing/2017/model3d" xmlns:o="urn:schemas-microsoft-com:office:office" xmlns:oel="http://schemas.microsoft.com/office/2019/extlst" xmlns:r="http://schemas.openxmlformats.org/officeDocument/2006/relationships" xmlns:m="http://schemas.openxmlformats.org/officeDocument/2006/math" xmlns:v="urn:schemas-microsoft-com:vml" xmlns:wp14="http://schemas.microsoft.com/office/word/2010/wordprocessingDrawing" xmlns:wp="http://schemas.openxmlformats.org/drawingml/2006/wordprocessingDrawing" xmlns:w10="urn:schemas-microsoft-com:office:word" xmlns:w="http://schemas.openxmlformats.org/wordprocessingml/2006/main" xmlns:w14="http://schemas.microsoft.com/office/word/2010/wordml" xmlns:w15="http://schemas.microsoft.com/office/word/2012/wordml" xmlns:w16cex="http://schemas.microsoft.com/office/word/2018/wordml/cex" xmlns:w16cid="http://schemas.microsoft.com/office/word/2016/wordml/cid" xmlns:w16="http://schemas.microsoft.com/office/word/2018/wordml" xmlns:w16du="http://schemas.microsoft.com/office/word/2023/wordml/word16du" xmlns:w16sdtdh="http://schemas.microsoft.com/office/word/2020/wordml/sdtdatahash" xmlns:w16sdtfl="http://schemas.microsoft.com/office/word/2024/wordml/sdtformatlock" xmlns:w16se="http://schemas.microsoft.com/office/word/2015/wordml/symex" xmlns:wpg="http://schemas.microsoft.com/office/word/2010/wordprocessingGroup" xmlns:wpi="http://schemas.microsoft.com/office/word/2010/wordprocessingInk" xmlns:wne="http://schemas.microsoft.com/office/word/2006/wordml" xmlns:wps="http://schemas.microsoft.com/office/word/2010/wordprocessingShape" mc:Ignorable="w14 w15 w16se w16cid w16 w16cex w16sdtdh w16sdtfl w16du wp14">
+<w:ftr xmlns:wpc="http://schemas.microsoft.com/office/word/2010/wordprocessingCanvas" xmlns:cx="http://schemas.microsoft.com/office/drawing/2014/chartex" xmlns:cx1="http://schemas.microsoft.com/office/drawing/2015/9/8/chartex" xmlns:cx2="http://schemas.microsoft.com/office/drawing/2015/10/21/chartex" xmlns:cx3="http://schemas.microsoft.com/office/drawing/2016/5/9/chartex" xmlns:cx4="http://schemas.microsoft.com/office/drawing/2016/5/10/chartex" xmlns:cx5="http://schemas.microsoft.com/office/drawing/2016/5/11/chartex" xmlns:cx6="http://schemas.microsoft.com/office/drawing/2016/5/12/chartex" xmlns:cx7="http://schemas.microsoft.com/office/drawing/2016/5/13/chartex" xmlns:cx8="http://schemas.microsoft.com/office/drawing/2016/5/14/chartex" xmlns:mc="http://schemas.openxmlformats.org/markup-compatibility/2006" xmlns:aink="http://schemas.microsoft.com/office/drawing/2016/ink" xmlns:am3d="http://schemas.microsoft.com/office/drawing/2017/model3d" xmlns:o="urn:schemas-microsoft-com:office:office" xmlns:oel="http://schemas.microsoft.com/office/2019/extlst" xmlns:r="http://schemas.openxmlformats.org/officeDocument/2006/relationships" xmlns:m="http://schemas.openxmlformats.org/officeDocument/2006/math" xmlns:v="urn:schemas-microsoft-com:vml" xmlns:wp14="http://schemas.microsoft.com/office/word/2010/wordprocessingDrawing" xmlns:wp="http://schemas.openxmlformats.org/drawingml/2006/wordprocessingDrawing" xmlns:w10="urn:schemas-microsoft-com:office:word" xmlns:w="http://schemas.openxmlformats.org/wordprocessingml/2006/main" xmlns:w14="http://schemas.microsoft.com/office/word/2010/wordml" xmlns:w15="http://schemas.microsoft.com/office/word/2012/wordml" xmlns:w16cei="http://schemas.microsoft.com/office/word/2026/wordml/cei" xmlns:w16cex="http://schemas.microsoft.com/office/word/2018/wordml/cex" xmlns:w16cid="http://schemas.microsoft.com/office/word/2016/wordml/cid" xmlns:w16="http://schemas.microsoft.com/office/word/2018/wordml" xmlns:w16du="http://schemas.microsoft.com/office/word/2023/wordml/word16du" xmlns:w16sdtdh="http://schemas.microsoft.com/office/word/2020/wordml/sdtdatahash" xmlns:w16sdtfl="http://schemas.microsoft.com/office/word/2024/wordml/sdtformatlock" xmlns:w16se="http://schemas.microsoft.com/office/word/2015/wordml/symex" xmlns:wpg="http://schemas.microsoft.com/office/word/2010/wordprocessingGroup" xmlns:wpi="http://schemas.microsoft.com/office/word/2010/wordprocessingInk" xmlns:wne="http://schemas.microsoft.com/office/word/2006/wordml" xmlns:wps="http://schemas.microsoft.com/office/word/2010/wordprocessingShape" mc:Ignorable="w14 w15 w16se w16cid w16 w16cex w16sdtdh w16sdtfl w16du wp14">
   <w:p>
     <w:pPr>
       <w:pBdr>
@@ -1541,7 +1523,7 @@
 </file>
 
 <file path=word/footnotes.xml><?xml version="1.0" encoding="utf-8"?>
-<w:footnotes xmlns:wpc="http://schemas.microsoft.com/office/word/2010/wordprocessingCanvas" xmlns:cx="http://schemas.microsoft.com/office/drawing/2014/chartex" xmlns:cx1="http://schemas.microsoft.com/office/drawing/2015/9/8/chartex" xmlns:cx2="http://schemas.microsoft.com/office/drawing/2015/10/21/chartex" xmlns:cx3="http://schemas.microsoft.com/office/drawing/2016/5/9/chartex" xmlns:cx4="http://schemas.microsoft.com/office/drawing/2016/5/10/chartex" xmlns:cx5="http://schemas.microsoft.com/office/drawing/2016/5/11/chartex" xmlns:cx6="http://schemas.microsoft.com/office/drawing/2016/5/12/chartex" xmlns:cx7="http://schemas.microsoft.com/office/drawing/2016/5/13/chartex" xmlns:cx8="http://schemas.microsoft.com/office/drawing/2016/5/14/chartex" xmlns:mc="http://schemas.openxmlformats.org/markup-compatibility/2006" xmlns:aink="http://schemas.microsoft.com/office/drawing/2016/ink" xmlns:am3d="http://schemas.microsoft.com/office/drawing/2017/model3d" xmlns:o="urn:schemas-microsoft-com:office:office" xmlns:oel="http://schemas.microsoft.com/office/2019/extlst" xmlns:r="http://schemas.openxmlformats.org/officeDocument/2006/relationships" xmlns:m="http://schemas.openxmlformats.org/officeDocument/2006/math" xmlns:v="urn:schemas-microsoft-com:vml" xmlns:wp14="http://schemas.microsoft.com/office/word/2010/wordprocessingDrawing" xmlns:wp="http://schemas.openxmlformats.org/drawingml/2006/wordprocessingDrawing" xmlns:w10="urn:schemas-microsoft-com:office:word" xmlns:w="http://schemas.openxmlformats.org/wordprocessingml/2006/main" xmlns:w14="http://schemas.microsoft.com/office/word/2010/wordml" xmlns:w15="http://schemas.microsoft.com/office/word/2012/wordml" xmlns:w16cex="http://schemas.microsoft.com/office/word/2018/wordml/cex" xmlns:w16cid="http://schemas.microsoft.com/office/word/2016/wordml/cid" xmlns:w16="http://schemas.microsoft.com/office/word/2018/wordml" xmlns:w16du="http://schemas.microsoft.com/office/word/2023/wordml/word16du" xmlns:w16sdtdh="http://schemas.microsoft.com/office/word/2020/wordml/sdtdatahash" xmlns:w16sdtfl="http://schemas.microsoft.com/office/word/2024/wordml/sdtformatlock" xmlns:w16se="http://schemas.microsoft.com/office/word/2015/wordml/symex" xmlns:wpg="http://schemas.microsoft.com/office/word/2010/wordprocessingGroup" xmlns:wpi="http://schemas.microsoft.com/office/word/2010/wordprocessingInk" xmlns:wne="http://schemas.microsoft.com/office/word/2006/wordml" xmlns:wps="http://schemas.microsoft.com/office/word/2010/wordprocessingShape" mc:Ignorable="w14 w15 w16se w16cid w16 w16cex w16sdtdh w16sdtfl w16du wp14">
+<w:footnotes xmlns:wpc="http://schemas.microsoft.com/office/word/2010/wordprocessingCanvas" xmlns:cx="http://schemas.microsoft.com/office/drawing/2014/chartex" xmlns:cx1="http://schemas.microsoft.com/office/drawing/2015/9/8/chartex" xmlns:cx2="http://schemas.microsoft.com/office/drawing/2015/10/21/chartex" xmlns:cx3="http://schemas.microsoft.com/office/drawing/2016/5/9/chartex" xmlns:cx4="http://schemas.microsoft.com/office/drawing/2016/5/10/chartex" xmlns:cx5="http://schemas.microsoft.com/office/drawing/2016/5/11/chartex" xmlns:cx6="http://schemas.microsoft.com/office/drawing/2016/5/12/chartex" xmlns:cx7="http://schemas.microsoft.com/office/drawing/2016/5/13/chartex" xmlns:cx8="http://schemas.microsoft.com/office/drawing/2016/5/14/chartex" xmlns:mc="http://schemas.openxmlformats.org/markup-compatibility/2006" xmlns:aink="http://schemas.microsoft.com/office/drawing/2016/ink" xmlns:am3d="http://schemas.microsoft.com/office/drawing/2017/model3d" xmlns:o="urn:schemas-microsoft-com:office:office" xmlns:oel="http://schemas.microsoft.com/office/2019/extlst" xmlns:r="http://schemas.openxmlformats.org/officeDocument/2006/relationships" xmlns:m="http://schemas.openxmlformats.org/officeDocument/2006/math" xmlns:v="urn:schemas-microsoft-com:vml" xmlns:wp14="http://schemas.microsoft.com/office/word/2010/wordprocessingDrawing" xmlns:wp="http://schemas.openxmlformats.org/drawingml/2006/wordprocessingDrawing" xmlns:w10="urn:schemas-microsoft-com:office:word" xmlns:w="http://schemas.openxmlformats.org/wordprocessingml/2006/main" xmlns:w14="http://schemas.microsoft.com/office/word/2010/wordml" xmlns:w15="http://schemas.microsoft.com/office/word/2012/wordml" xmlns:w16cei="http://schemas.microsoft.com/office/word/2026/wordml/cei" xmlns:w16cex="http://schemas.microsoft.com/office/word/2018/wordml/cex" xmlns:w16cid="http://schemas.microsoft.com/office/word/2016/wordml/cid" xmlns:w16="http://schemas.microsoft.com/office/word/2018/wordml" xmlns:w16du="http://schemas.microsoft.com/office/word/2023/wordml/word16du" xmlns:w16sdtdh="http://schemas.microsoft.com/office/word/2020/wordml/sdtdatahash" xmlns:w16sdtfl="http://schemas.microsoft.com/office/word/2024/wordml/sdtformatlock" xmlns:w16se="http://schemas.microsoft.com/office/word/2015/wordml/symex" xmlns:wpg="http://schemas.microsoft.com/office/word/2010/wordprocessingGroup" xmlns:wpi="http://schemas.microsoft.com/office/word/2010/wordprocessingInk" xmlns:wne="http://schemas.microsoft.com/office/word/2006/wordml" xmlns:wps="http://schemas.microsoft.com/office/word/2010/wordprocessingShape" mc:Ignorable="w14 w15 w16se w16cid w16 w16cex w16sdtdh w16sdtfl w16du wp14">
   <w:footnote w:type="separator" w:id="-1">
     <w:p>
       <w:pPr>
@@ -1573,7 +1555,7 @@
 </file>
 
 <file path=word/header1.xml><?xml version="1.0" encoding="utf-8"?>
-<w:hdr xmlns:wpc="http://schemas.microsoft.com/office/word/2010/wordprocessingCanvas" xmlns:cx="http://schemas.microsoft.com/office/drawing/2014/chartex" xmlns:cx1="http://schemas.microsoft.com/office/drawing/2015/9/8/chartex" xmlns:cx2="http://schemas.microsoft.com/office/drawing/2015/10/21/chartex" xmlns:cx3="http://schemas.microsoft.com/office/drawing/2016/5/9/chartex" xmlns:cx4="http://schemas.microsoft.com/office/drawing/2016/5/10/chartex" xmlns:cx5="http://schemas.microsoft.com/office/drawing/2016/5/11/chartex" xmlns:cx6="http://schemas.microsoft.com/office/drawing/2016/5/12/chartex" xmlns:cx7="http://schemas.microsoft.com/office/drawing/2016/5/13/chartex" xmlns:cx8="http://schemas.microsoft.com/office/drawing/2016/5/14/chartex" xmlns:mc="http://schemas.openxmlformats.org/markup-compatibility/2006" xmlns:aink="http://schemas.microsoft.com/office/drawing/2016/ink" xmlns:am3d="http://schemas.microsoft.com/office/drawing/2017/model3d" xmlns:o="urn:schemas-microsoft-com:office:office" xmlns:oel="http://schemas.microsoft.com/office/2019/extlst" xmlns:r="http://schemas.openxmlformats.org/officeDocument/2006/relationships" xmlns:m="http://schemas.openxmlformats.org/officeDocument/2006/math" xmlns:v="urn:schemas-microsoft-com:vml" xmlns:wp14="http://schemas.microsoft.com/office/word/2010/wordprocessingDrawing" xmlns:wp="http://schemas.openxmlformats.org/drawingml/2006/wordprocessingDrawing" xmlns:w10="urn:schemas-microsoft-com:office:word" xmlns:w="http://schemas.openxmlformats.org/wordprocessingml/2006/main" xmlns:w14="http://schemas.microsoft.com/office/word/2010/wordml" xmlns:w15="http://schemas.microsoft.com/office/word/2012/wordml" xmlns:w16cex="http://schemas.microsoft.com/office/word/2018/wordml/cex" xmlns:w16cid="http://schemas.microsoft.com/office/word/2016/wordml/cid" xmlns:w16="http://schemas.microsoft.com/office/word/2018/wordml" xmlns:w16du="http://schemas.microsoft.com/office/word/2023/wordml/word16du" xmlns:w16sdtdh="http://schemas.microsoft.com/office/word/2020/wordml/sdtdatahash" xmlns:w16sdtfl="http://schemas.microsoft.com/office/word/2024/wordml/sdtformatlock" xmlns:w16se="http://schemas.microsoft.com/office/word/2015/wordml/symex" xmlns:wpg="http://schemas.microsoft.com/office/word/2010/wordprocessingGroup" xmlns:wpi="http://schemas.microsoft.com/office/word/2010/wordprocessingInk" xmlns:wne="http://schemas.microsoft.com/office/word/2006/wordml" xmlns:wps="http://schemas.microsoft.com/office/word/2010/wordprocessingShape" mc:Ignorable="w14 w15 w16se w16cid w16 w16cex w16sdtdh w16sdtfl w16du wp14">
+<w:hdr xmlns:wpc="http://schemas.microsoft.com/office/word/2010/wordprocessingCanvas" xmlns:cx="http://schemas.microsoft.com/office/drawing/2014/chartex" xmlns:cx1="http://schemas.microsoft.com/office/drawing/2015/9/8/chartex" xmlns:cx2="http://schemas.microsoft.com/office/drawing/2015/10/21/chartex" xmlns:cx3="http://schemas.microsoft.com/office/drawing/2016/5/9/chartex" xmlns:cx4="http://schemas.microsoft.com/office/drawing/2016/5/10/chartex" xmlns:cx5="http://schemas.microsoft.com/office/drawing/2016/5/11/chartex" xmlns:cx6="http://schemas.microsoft.com/office/drawing/2016/5/12/chartex" xmlns:cx7="http://schemas.microsoft.com/office/drawing/2016/5/13/chartex" xmlns:cx8="http://schemas.microsoft.com/office/drawing/2016/5/14/chartex" xmlns:mc="http://schemas.openxmlformats.org/markup-compatibility/2006" xmlns:aink="http://schemas.microsoft.com/office/drawing/2016/ink" xmlns:am3d="http://schemas.microsoft.com/office/drawing/2017/model3d" xmlns:o="urn:schemas-microsoft-com:office:office" xmlns:oel="http://schemas.microsoft.com/office/2019/extlst" xmlns:r="http://schemas.openxmlformats.org/officeDocument/2006/relationships" xmlns:m="http://schemas.openxmlformats.org/officeDocument/2006/math" xmlns:v="urn:schemas-microsoft-com:vml" xmlns:wp14="http://schemas.microsoft.com/office/word/2010/wordprocessingDrawing" xmlns:wp="http://schemas.openxmlformats.org/drawingml/2006/wordprocessingDrawing" xmlns:w10="urn:schemas-microsoft-com:office:word" xmlns:w="http://schemas.openxmlformats.org/wordprocessingml/2006/main" xmlns:w14="http://schemas.microsoft.com/office/word/2010/wordml" xmlns:w15="http://schemas.microsoft.com/office/word/2012/wordml" xmlns:w16cei="http://schemas.microsoft.com/office/word/2026/wordml/cei" xmlns:w16cex="http://schemas.microsoft.com/office/word/2018/wordml/cex" xmlns:w16cid="http://schemas.microsoft.com/office/word/2016/wordml/cid" xmlns:w16="http://schemas.microsoft.com/office/word/2018/wordml" xmlns:w16du="http://schemas.microsoft.com/office/word/2023/wordml/word16du" xmlns:w16sdtdh="http://schemas.microsoft.com/office/word/2020/wordml/sdtdatahash" xmlns:w16sdtfl="http://schemas.microsoft.com/office/word/2024/wordml/sdtformatlock" xmlns:w16se="http://schemas.microsoft.com/office/word/2015/wordml/symex" xmlns:wpg="http://schemas.microsoft.com/office/word/2010/wordprocessingGroup" xmlns:wpi="http://schemas.microsoft.com/office/word/2010/wordprocessingInk" xmlns:wne="http://schemas.microsoft.com/office/word/2006/wordml" xmlns:wps="http://schemas.microsoft.com/office/word/2010/wordprocessingShape" mc:Ignorable="w14 w15 w16se w16cid w16 w16cex w16sdtdh w16sdtfl w16du wp14">
   <w:p>
     <w:pPr>
       <w:pBdr>
@@ -1597,7 +1579,7 @@
 </file>
 
 <file path=word/header2.xml><?xml version="1.0" encoding="utf-8"?>
-<w:hdr xmlns:wpc="http://schemas.microsoft.com/office/word/2010/wordprocessingCanvas" xmlns:cx="http://schemas.microsoft.com/office/drawing/2014/chartex" xmlns:cx1="http://schemas.microsoft.com/office/drawing/2015/9/8/chartex" xmlns:cx2="http://schemas.microsoft.com/office/drawing/2015/10/21/chartex" xmlns:cx3="http://schemas.microsoft.com/office/drawing/2016/5/9/chartex" xmlns:cx4="http://schemas.microsoft.com/office/drawing/2016/5/10/chartex" xmlns:cx5="http://schemas.microsoft.com/office/drawing/2016/5/11/chartex" xmlns:cx6="http://schemas.microsoft.com/office/drawing/2016/5/12/chartex" xmlns:cx7="http://schemas.microsoft.com/office/drawing/2016/5/13/chartex" xmlns:cx8="http://schemas.microsoft.com/office/drawing/2016/5/14/chartex" xmlns:mc="http://schemas.openxmlformats.org/markup-compatibility/2006" xmlns:aink="http://schemas.microsoft.com/office/drawing/2016/ink" xmlns:am3d="http://schemas.microsoft.com/office/drawing/2017/model3d" xmlns:o="urn:schemas-microsoft-com:office:office" xmlns:oel="http://schemas.microsoft.com/office/2019/extlst" xmlns:r="http://schemas.openxmlformats.org/officeDocument/2006/relationships" xmlns:m="http://schemas.openxmlformats.org/officeDocument/2006/math" xmlns:v="urn:schemas-microsoft-com:vml" xmlns:wp14="http://schemas.microsoft.com/office/word/2010/wordprocessingDrawing" xmlns:wp="http://schemas.openxmlformats.org/drawingml/2006/wordprocessingDrawing" xmlns:w10="urn:schemas-microsoft-com:office:word" xmlns:w="http://schemas.openxmlformats.org/wordprocessingml/2006/main" xmlns:w14="http://schemas.microsoft.com/office/word/2010/wordml" xmlns:w15="http://schemas.microsoft.com/office/word/2012/wordml" xmlns:w16cex="http://schemas.microsoft.com/office/word/2018/wordml/cex" xmlns:w16cid="http://schemas.microsoft.com/office/word/2016/wordml/cid" xmlns:w16="http://schemas.microsoft.com/office/word/2018/wordml" xmlns:w16du="http://schemas.microsoft.com/office/word/2023/wordml/word16du" xmlns:w16sdtdh="http://schemas.microsoft.com/office/word/2020/wordml/sdtdatahash" xmlns:w16sdtfl="http://schemas.microsoft.com/office/word/2024/wordml/sdtformatlock" xmlns:w16se="http://schemas.microsoft.com/office/word/2015/wordml/symex" xmlns:wpg="http://schemas.microsoft.com/office/word/2010/wordprocessingGroup" xmlns:wpi="http://schemas.microsoft.com/office/word/2010/wordprocessingInk" xmlns:wne="http://schemas.microsoft.com/office/word/2006/wordml" xmlns:wps="http://schemas.microsoft.com/office/word/2010/wordprocessingShape" mc:Ignorable="w14 w15 w16se w16cid w16 w16cex w16sdtdh w16sdtfl w16du wp14">
+<w:hdr xmlns:wpc="http://schemas.microsoft.com/office/word/2010/wordprocessingCanvas" xmlns:cx="http://schemas.microsoft.com/office/drawing/2014/chartex" xmlns:cx1="http://schemas.microsoft.com/office/drawing/2015/9/8/chartex" xmlns:cx2="http://schemas.microsoft.com/office/drawing/2015/10/21/chartex" xmlns:cx3="http://schemas.microsoft.com/office/drawing/2016/5/9/chartex" xmlns:cx4="http://schemas.microsoft.com/office/drawing/2016/5/10/chartex" xmlns:cx5="http://schemas.microsoft.com/office/drawing/2016/5/11/chartex" xmlns:cx6="http://schemas.microsoft.com/office/drawing/2016/5/12/chartex" xmlns:cx7="http://schemas.microsoft.com/office/drawing/2016/5/13/chartex" xmlns:cx8="http://schemas.microsoft.com/office/drawing/2016/5/14/chartex" xmlns:mc="http://schemas.openxmlformats.org/markup-compatibility/2006" xmlns:aink="http://schemas.microsoft.com/office/drawing/2016/ink" xmlns:am3d="http://schemas.microsoft.com/office/drawing/2017/model3d" xmlns:o="urn:schemas-microsoft-com:office:office" xmlns:oel="http://schemas.microsoft.com/office/2019/extlst" xmlns:r="http://schemas.openxmlformats.org/officeDocument/2006/relationships" xmlns:m="http://schemas.openxmlformats.org/officeDocument/2006/math" xmlns:v="urn:schemas-microsoft-com:vml" xmlns:wp14="http://schemas.microsoft.com/office/word/2010/wordprocessingDrawing" xmlns:wp="http://schemas.openxmlformats.org/drawingml/2006/wordprocessingDrawing" xmlns:w10="urn:schemas-microsoft-com:office:word" xmlns:w="http://schemas.openxmlformats.org/wordprocessingml/2006/main" xmlns:w14="http://schemas.microsoft.com/office/word/2010/wordml" xmlns:w15="http://schemas.microsoft.com/office/word/2012/wordml" xmlns:w16cei="http://schemas.microsoft.com/office/word/2026/wordml/cei" xmlns:w16cex="http://schemas.microsoft.com/office/word/2018/wordml/cex" xmlns:w16cid="http://schemas.microsoft.com/office/word/2016/wordml/cid" xmlns:w16="http://schemas.microsoft.com/office/word/2018/wordml" xmlns:w16du="http://schemas.microsoft.com/office/word/2023/wordml/word16du" xmlns:w16sdtdh="http://schemas.microsoft.com/office/word/2020/wordml/sdtdatahash" xmlns:w16sdtfl="http://schemas.microsoft.com/office/word/2024/wordml/sdtformatlock" xmlns:w16se="http://schemas.microsoft.com/office/word/2015/wordml/symex" xmlns:wpg="http://schemas.microsoft.com/office/word/2010/wordprocessingGroup" xmlns:wpi="http://schemas.microsoft.com/office/word/2010/wordprocessingInk" xmlns:wne="http://schemas.microsoft.com/office/word/2006/wordml" xmlns:wps="http://schemas.microsoft.com/office/word/2010/wordprocessingShape" mc:Ignorable="w14 w15 w16se w16cid w16 w16cex w16sdtdh w16sdtfl w16du wp14">
   <w:p>
     <w:pPr>
       <w:pBdr>
@@ -1621,7 +1603,7 @@
 </file>
 
 <file path=word/header3.xml><?xml version="1.0" encoding="utf-8"?>
-<w:hdr xmlns:wpc="http://schemas.microsoft.com/office/word/2010/wordprocessingCanvas" xmlns:cx="http://schemas.microsoft.com/office/drawing/2014/chartex" xmlns:cx1="http://schemas.microsoft.com/office/drawing/2015/9/8/chartex" xmlns:cx2="http://schemas.microsoft.com/office/drawing/2015/10/21/chartex" xmlns:cx3="http://schemas.microsoft.com/office/drawing/2016/5/9/chartex" xmlns:cx4="http://schemas.microsoft.com/office/drawing/2016/5/10/chartex" xmlns:cx5="http://schemas.microsoft.com/office/drawing/2016/5/11/chartex" xmlns:cx6="http://schemas.microsoft.com/office/drawing/2016/5/12/chartex" xmlns:cx7="http://schemas.microsoft.com/office/drawing/2016/5/13/chartex" xmlns:cx8="http://schemas.microsoft.com/office/drawing/2016/5/14/chartex" xmlns:mc="http://schemas.openxmlformats.org/markup-compatibility/2006" xmlns:aink="http://schemas.microsoft.com/office/drawing/2016/ink" xmlns:am3d="http://schemas.microsoft.com/office/drawing/2017/model3d" xmlns:o="urn:schemas-microsoft-com:office:office" xmlns:oel="http://schemas.microsoft.com/office/2019/extlst" xmlns:r="http://schemas.openxmlformats.org/officeDocument/2006/relationships" xmlns:m="http://schemas.openxmlformats.org/officeDocument/2006/math" xmlns:v="urn:schemas-microsoft-com:vml" xmlns:wp14="http://schemas.microsoft.com/office/word/2010/wordprocessingDrawing" xmlns:wp="http://schemas.openxmlformats.org/drawingml/2006/wordprocessingDrawing" xmlns:w10="urn:schemas-microsoft-com:office:word" xmlns:w="http://schemas.openxmlformats.org/wordprocessingml/2006/main" xmlns:w14="http://schemas.microsoft.com/office/word/2010/wordml" xmlns:w15="http://schemas.microsoft.com/office/word/2012/wordml" xmlns:w16cex="http://schemas.microsoft.com/office/word/2018/wordml/cex" xmlns:w16cid="http://schemas.microsoft.com/office/word/2016/wordml/cid" xmlns:w16="http://schemas.microsoft.com/office/word/2018/wordml" xmlns:w16du="http://schemas.microsoft.com/office/word/2023/wordml/word16du" xmlns:w16sdtdh="http://schemas.microsoft.com/office/word/2020/wordml/sdtdatahash" xmlns:w16sdtfl="http://schemas.microsoft.com/office/word/2024/wordml/sdtformatlock" xmlns:w16se="http://schemas.microsoft.com/office/word/2015/wordml/symex" xmlns:wpg="http://schemas.microsoft.com/office/word/2010/wordprocessingGroup" xmlns:wpi="http://schemas.microsoft.com/office/word/2010/wordprocessingInk" xmlns:wne="http://schemas.microsoft.com/office/word/2006/wordml" xmlns:wps="http://schemas.microsoft.com/office/word/2010/wordprocessingShape" mc:Ignorable="w14 w15 w16se w16cid w16 w16cex w16sdtdh w16sdtfl w16du wp14">
+<w:hdr xmlns:wpc="http://schemas.microsoft.com/office/word/2010/wordprocessingCanvas" xmlns:cx="http://schemas.microsoft.com/office/drawing/2014/chartex" xmlns:cx1="http://schemas.microsoft.com/office/drawing/2015/9/8/chartex" xmlns:cx2="http://schemas.microsoft.com/office/drawing/2015/10/21/chartex" xmlns:cx3="http://schemas.microsoft.com/office/drawing/2016/5/9/chartex" xmlns:cx4="http://schemas.microsoft.com/office/drawing/2016/5/10/chartex" xmlns:cx5="http://schemas.microsoft.com/office/drawing/2016/5/11/chartex" xmlns:cx6="http://schemas.microsoft.com/office/drawing/2016/5/12/chartex" xmlns:cx7="http://schemas.microsoft.com/office/drawing/2016/5/13/chartex" xmlns:cx8="http://schemas.microsoft.com/office/drawing/2016/5/14/chartex" xmlns:mc="http://schemas.openxmlformats.org/markup-compatibility/2006" xmlns:aink="http://schemas.microsoft.com/office/drawing/2016/ink" xmlns:am3d="http://schemas.microsoft.com/office/drawing/2017/model3d" xmlns:o="urn:schemas-microsoft-com:office:office" xmlns:oel="http://schemas.microsoft.com/office/2019/extlst" xmlns:r="http://schemas.openxmlformats.org/officeDocument/2006/relationships" xmlns:m="http://schemas.openxmlformats.org/officeDocument/2006/math" xmlns:v="urn:schemas-microsoft-com:vml" xmlns:wp14="http://schemas.microsoft.com/office/word/2010/wordprocessingDrawing" xmlns:wp="http://schemas.openxmlformats.org/drawingml/2006/wordprocessingDrawing" xmlns:w10="urn:schemas-microsoft-com:office:word" xmlns:w="http://schemas.openxmlformats.org/wordprocessingml/2006/main" xmlns:w14="http://schemas.microsoft.com/office/word/2010/wordml" xmlns:w15="http://schemas.microsoft.com/office/word/2012/wordml" xmlns:w16cei="http://schemas.microsoft.com/office/word/2026/wordml/cei" xmlns:w16cex="http://schemas.microsoft.com/office/word/2018/wordml/cex" xmlns:w16cid="http://schemas.microsoft.com/office/word/2016/wordml/cid" xmlns:w16="http://schemas.microsoft.com/office/word/2018/wordml" xmlns:w16du="http://schemas.microsoft.com/office/word/2023/wordml/word16du" xmlns:w16sdtdh="http://schemas.microsoft.com/office/word/2020/wordml/sdtdatahash" xmlns:w16sdtfl="http://schemas.microsoft.com/office/word/2024/wordml/sdtformatlock" xmlns:w16se="http://schemas.microsoft.com/office/word/2015/wordml/symex" xmlns:wpg="http://schemas.microsoft.com/office/word/2010/wordprocessingGroup" xmlns:wpi="http://schemas.microsoft.com/office/word/2010/wordprocessingInk" xmlns:wne="http://schemas.microsoft.com/office/word/2006/wordml" xmlns:wps="http://schemas.microsoft.com/office/word/2010/wordprocessingShape" mc:Ignorable="w14 w15 w16se w16cid w16 w16cex w16sdtdh w16sdtfl w16du wp14">
   <w:p>
     <w:pPr>
       <w:pBdr>
@@ -1645,7 +1627,7 @@
 </file>
 
 <file path=word/numbering.xml><?xml version="1.0" encoding="utf-8"?>
-<w:numbering xmlns:wpc="http://schemas.microsoft.com/office/word/2010/wordprocessingCanvas" xmlns:cx="http://schemas.microsoft.com/office/drawing/2014/chartex" xmlns:cx1="http://schemas.microsoft.com/office/drawing/2015/9/8/chartex" xmlns:cx2="http://schemas.microsoft.com/office/drawing/2015/10/21/chartex" xmlns:cx3="http://schemas.microsoft.com/office/drawing/2016/5/9/chartex" xmlns:cx4="http://schemas.microsoft.com/office/drawing/2016/5/10/chartex" xmlns:cx5="http://schemas.microsoft.com/office/drawing/2016/5/11/chartex" xmlns:cx6="http://schemas.microsoft.com/office/drawing/2016/5/12/chartex" xmlns:cx7="http://schemas.microsoft.com/office/drawing/2016/5/13/chartex" xmlns:cx8="http://schemas.microsoft.com/office/drawing/2016/5/14/chartex" xmlns:mc="http://schemas.openxmlformats.org/markup-compatibility/2006" xmlns:aink="http://schemas.microsoft.com/office/drawing/2016/ink" xmlns:am3d="http://schemas.microsoft.com/office/drawing/2017/model3d" xmlns:o="urn:schemas-microsoft-com:office:office" xmlns:oel="http://schemas.microsoft.com/office/2019/extlst" xmlns:r="http://schemas.openxmlformats.org/officeDocument/2006/relationships" xmlns:m="http://schemas.openxmlformats.org/officeDocument/2006/math" xmlns:v="urn:schemas-microsoft-com:vml" xmlns:wp14="http://schemas.microsoft.com/office/word/2010/wordprocessingDrawing" xmlns:wp="http://schemas.openxmlformats.org/drawingml/2006/wordprocessingDrawing" xmlns:w10="urn:schemas-microsoft-com:office:word" xmlns:w="http://schemas.openxmlformats.org/wordprocessingml/2006/main" xmlns:w14="http://schemas.microsoft.com/office/word/2010/wordml" xmlns:w15="http://schemas.microsoft.com/office/word/2012/wordml" xmlns:w16cex="http://schemas.microsoft.com/office/word/2018/wordml/cex" xmlns:w16cid="http://schemas.microsoft.com/office/word/2016/wordml/cid" xmlns:w16="http://schemas.microsoft.com/office/word/2018/wordml" xmlns:w16du="http://schemas.microsoft.com/office/word/2023/wordml/word16du" xmlns:w16sdtdh="http://schemas.microsoft.com/office/word/2020/wordml/sdtdatahash" xmlns:w16sdtfl="http://schemas.microsoft.com/office/word/2024/wordml/sdtformatlock" xmlns:w16se="http://schemas.microsoft.com/office/word/2015/wordml/symex" xmlns:wpg="http://schemas.microsoft.com/office/word/2010/wordprocessingGroup" xmlns:wpi="http://schemas.microsoft.com/office/word/2010/wordprocessingInk" xmlns:wne="http://schemas.microsoft.com/office/word/2006/wordml" xmlns:wps="http://schemas.microsoft.com/office/word/2010/wordprocessingShape" mc:Ignorable="w14 w15 w16se w16cid w16 w16cex w16sdtdh w16sdtfl w16du wp14">
+<w:numbering xmlns:wpc="http://schemas.microsoft.com/office/word/2010/wordprocessingCanvas" xmlns:cx="http://schemas.microsoft.com/office/drawing/2014/chartex" xmlns:cx1="http://schemas.microsoft.com/office/drawing/2015/9/8/chartex" xmlns:cx2="http://schemas.microsoft.com/office/drawing/2015/10/21/chartex" xmlns:cx3="http://schemas.microsoft.com/office/drawing/2016/5/9/chartex" xmlns:cx4="http://schemas.microsoft.com/office/drawing/2016/5/10/chartex" xmlns:cx5="http://schemas.microsoft.com/office/drawing/2016/5/11/chartex" xmlns:cx6="http://schemas.microsoft.com/office/drawing/2016/5/12/chartex" xmlns:cx7="http://schemas.microsoft.com/office/drawing/2016/5/13/chartex" xmlns:cx8="http://schemas.microsoft.com/office/drawing/2016/5/14/chartex" xmlns:mc="http://schemas.openxmlformats.org/markup-compatibility/2006" xmlns:aink="http://schemas.microsoft.com/office/drawing/2016/ink" xmlns:am3d="http://schemas.microsoft.com/office/drawing/2017/model3d" xmlns:o="urn:schemas-microsoft-com:office:office" xmlns:oel="http://schemas.microsoft.com/office/2019/extlst" xmlns:r="http://schemas.openxmlformats.org/officeDocument/2006/relationships" xmlns:m="http://schemas.openxmlformats.org/officeDocument/2006/math" xmlns:v="urn:schemas-microsoft-com:vml" xmlns:wp14="http://schemas.microsoft.com/office/word/2010/wordprocessingDrawing" xmlns:wp="http://schemas.openxmlformats.org/drawingml/2006/wordprocessingDrawing" xmlns:w10="urn:schemas-microsoft-com:office:word" xmlns:w="http://schemas.openxmlformats.org/wordprocessingml/2006/main" xmlns:w14="http://schemas.microsoft.com/office/word/2010/wordml" xmlns:w15="http://schemas.microsoft.com/office/word/2012/wordml" xmlns:w16cei="http://schemas.microsoft.com/office/word/2026/wordml/cei" xmlns:w16cex="http://schemas.microsoft.com/office/word/2018/wordml/cex" xmlns:w16cid="http://schemas.microsoft.com/office/word/2016/wordml/cid" xmlns:w16="http://schemas.microsoft.com/office/word/2018/wordml" xmlns:w16du="http://schemas.microsoft.com/office/word/2023/wordml/word16du" xmlns:w16sdtdh="http://schemas.microsoft.com/office/word/2020/wordml/sdtdatahash" xmlns:w16sdtfl="http://schemas.microsoft.com/office/word/2024/wordml/sdtformatlock" xmlns:w16se="http://schemas.microsoft.com/office/word/2015/wordml/symex" xmlns:wpg="http://schemas.microsoft.com/office/word/2010/wordprocessingGroup" xmlns:wpi="http://schemas.microsoft.com/office/word/2010/wordprocessingInk" xmlns:wne="http://schemas.microsoft.com/office/word/2006/wordml" xmlns:wps="http://schemas.microsoft.com/office/word/2010/wordprocessingShape" mc:Ignorable="w14 w15 w16se w16cid w16 w16cex w16sdtdh w16sdtfl w16du wp14">
   <w:abstractNum w:abstractNumId="0" w15:restartNumberingAfterBreak="0">
     <w:nsid w:val="382E7F2B"/>
     <w:multiLevelType w:val="multilevel"/>
@@ -3168,6 +3150,32 @@
 </file>
 
 <file path=customXml/item1.xml><?xml version="1.0" encoding="utf-8"?>
+<go:gDocsCustomXmlDataStorage xmlns:go="http://customooxmlschemas.google.com/" xmlns:r="http://schemas.openxmlformats.org/officeDocument/2006/relationships">
+  <go:docsCustomData xmlns:go="http://customooxmlschemas.google.com/" roundtripDataSignature="AMtx7mjbuP+3rfmRwMwYdFXTchMQViRc5A==">AMUW2mW4StapEVBNkG7HrlPb+2R6N8RGyHtAU4Zgs8fTiPy+KZjxQMO381iPx3SVwc1Qz9+GnJOgmrNa71SlheQJtVfbdvKT9Y1KaB5YduVOn2Fnylld6kY43m+wenx9ZjyarQ0SKTxI</go:docsCustomData>
+</go:gDocsCustomXmlDataStorage>
+</file>
+
+<file path=customXml/item2.xml><?xml version="1.0" encoding="utf-8"?>
+<p:properties xmlns:p="http://schemas.microsoft.com/office/2006/metadata/properties" xmlns:xsi="http://www.w3.org/2001/XMLSchema-instance" xmlns:pc="http://schemas.microsoft.com/office/infopath/2007/PartnerControls">
+  <documentManagement>
+    <lcf76f155ced4ddcb4097134ff3c332f xmlns="0671de82-fb77-4741-a946-bbedde5d4f76">
+      <Terms xmlns="http://schemas.microsoft.com/office/infopath/2007/PartnerControls"/>
+    </lcf76f155ced4ddcb4097134ff3c332f>
+    <TaxCatchAll xmlns="bfe36008-4467-4f6a-b17f-684c3d9d556d" xsi:nil="true"/>
+  </documentManagement>
+</p:properties>
+</file>
+
+<file path=customXml/item3.xml><?xml version="1.0" encoding="utf-8"?>
+<?mso-contentType ?>
+<FormTemplates xmlns="http://schemas.microsoft.com/sharepoint/v3/contenttype/forms">
+  <Display>DocumentLibraryForm</Display>
+  <Edit>DocumentLibraryForm</Edit>
+  <New>DocumentLibraryForm</New>
+</FormTemplates>
+</file>
+
+<file path=customXml/item4.xml><?xml version="1.0" encoding="utf-8"?>
 <ct:contentTypeSchema xmlns:ct="http://schemas.microsoft.com/office/2006/metadata/contentType" xmlns:ma="http://schemas.microsoft.com/office/2006/metadata/properties/metaAttributes" ct:_="" ma:_="" ma:contentTypeName="Documento" ma:contentTypeID="0x01010068C79E2D4FBF494D8565142F1B408D23" ma:contentTypeVersion="13" ma:contentTypeDescription="Crear nuevo documento." ma:contentTypeScope="" ma:versionID="033ef99cf88c0d3b788bf7a31a0475d4">
   <xsd:schema xmlns:xsd="http://www.w3.org/2001/XMLSchema" xmlns:xs="http://www.w3.org/2001/XMLSchema" xmlns:p="http://schemas.microsoft.com/office/2006/metadata/properties" xmlns:ns2="0671de82-fb77-4741-a946-bbedde5d4f76" xmlns:ns3="bfe36008-4467-4f6a-b17f-684c3d9d556d" targetNamespace="http://schemas.microsoft.com/office/2006/metadata/properties" ma:root="true" ma:fieldsID="67b2ee94343aeb2f8f0920204dca2d30" ns2:_="" ns3:_="">
     <xsd:import namespace="0671de82-fb77-4741-a946-bbedde5d4f76"/>
@@ -3374,33 +3382,35 @@
 </ct:contentTypeSchema>
 </file>
 
-<file path=customXml/item2.xml><?xml version="1.0" encoding="utf-8"?>
-<?mso-contentType ?>
-<FormTemplates xmlns="http://schemas.microsoft.com/sharepoint/v3/contenttype/forms">
-  <Display>DocumentLibraryForm</Display>
-  <Edit>DocumentLibraryForm</Edit>
-  <New>DocumentLibraryForm</New>
-</FormTemplates>
+<file path=customXml/itemProps1.xml><?xml version="1.0" encoding="utf-8"?>
+<ds:datastoreItem xmlns:ds="http://schemas.openxmlformats.org/officeDocument/2006/customXml" ds:itemID="{11111111-1234-1234-1234-123412341234}">
+  <ds:schemaRefs>
+    <ds:schemaRef ds:uri="http://customooxmlschemas.google.com/"/>
+    <ds:schemaRef ds:uri="http://schemas.openxmlformats.org/officeDocument/2006/relationships"/>
+  </ds:schemaRefs>
+</ds:datastoreItem>
 </file>
 
-<file path=customXml/item3.xml><?xml version="1.0" encoding="utf-8"?>
-<p:properties xmlns:p="http://schemas.microsoft.com/office/2006/metadata/properties" xmlns:xsi="http://www.w3.org/2001/XMLSchema-instance" xmlns:pc="http://schemas.microsoft.com/office/infopath/2007/PartnerControls">
-  <documentManagement>
-    <lcf76f155ced4ddcb4097134ff3c332f xmlns="0671de82-fb77-4741-a946-bbedde5d4f76">
-      <Terms xmlns="http://schemas.microsoft.com/office/infopath/2007/PartnerControls"/>
-    </lcf76f155ced4ddcb4097134ff3c332f>
-    <TaxCatchAll xmlns="bfe36008-4467-4f6a-b17f-684c3d9d556d" xsi:nil="true"/>
-  </documentManagement>
-</p:properties>
+<file path=customXml/itemProps2.xml><?xml version="1.0" encoding="utf-8"?>
+<ds:datastoreItem xmlns:ds="http://schemas.openxmlformats.org/officeDocument/2006/customXml" ds:itemID="{41D49AF8-9F7B-460E-A6AE-E1703074752B}">
+  <ds:schemaRefs>
+    <ds:schemaRef ds:uri="http://schemas.microsoft.com/office/2006/metadata/properties"/>
+    <ds:schemaRef ds:uri="http://schemas.microsoft.com/office/infopath/2007/PartnerControls"/>
+    <ds:schemaRef ds:uri="0671de82-fb77-4741-a946-bbedde5d4f76"/>
+    <ds:schemaRef ds:uri="bfe36008-4467-4f6a-b17f-684c3d9d556d"/>
+  </ds:schemaRefs>
+</ds:datastoreItem>
 </file>
 
-<file path=customXml/item4.xml><?xml version="1.0" encoding="utf-8"?>
-<go:gDocsCustomXmlDataStorage xmlns:go="http://customooxmlschemas.google.com/" xmlns:r="http://schemas.openxmlformats.org/officeDocument/2006/relationships">
-  <go:docsCustomData xmlns:go="http://customooxmlschemas.google.com/" roundtripDataSignature="AMtx7mjbuP+3rfmRwMwYdFXTchMQViRc5A==">AMUW2mW4StapEVBNkG7HrlPb+2R6N8RGyHtAU4Zgs8fTiPy+KZjxQMO381iPx3SVwc1Qz9+GnJOgmrNa71SlheQJtVfbdvKT9Y1KaB5YduVOn2Fnylld6kY43m+wenx9ZjyarQ0SKTxI</go:docsCustomData>
-</go:gDocsCustomXmlDataStorage>
+<file path=customXml/itemProps3.xml><?xml version="1.0" encoding="utf-8"?>
+<ds:datastoreItem xmlns:ds="http://schemas.openxmlformats.org/officeDocument/2006/customXml" ds:itemID="{C3EF0F0D-D24C-4BEE-948F-3271E7C67003}">
+  <ds:schemaRefs>
+    <ds:schemaRef ds:uri="http://schemas.microsoft.com/sharepoint/v3/contenttype/forms"/>
+  </ds:schemaRefs>
+</ds:datastoreItem>
 </file>
 
-<file path=customXml/itemProps1.xml><?xml version="1.0" encoding="utf-8"?>
+<file path=customXml/itemProps4.xml><?xml version="1.0" encoding="utf-8"?>
 <ds:datastoreItem xmlns:ds="http://schemas.openxmlformats.org/officeDocument/2006/customXml" ds:itemID="{233D53A4-107F-4084-95ED-FC03705E1786}">
   <ds:schemaRefs>
     <ds:schemaRef ds:uri="http://schemas.microsoft.com/office/2006/metadata/contentType"/>
@@ -3417,32 +3427,4 @@
     <ds:schemaRef ds:uri="http://schemas.microsoft.com/internal/obd"/>
   </ds:schemaRefs>
 </ds:datastoreItem>
-</file>
-
-<file path=customXml/itemProps2.xml><?xml version="1.0" encoding="utf-8"?>
-<ds:datastoreItem xmlns:ds="http://schemas.openxmlformats.org/officeDocument/2006/customXml" ds:itemID="{C3EF0F0D-D24C-4BEE-948F-3271E7C67003}">
-  <ds:schemaRefs>
-    <ds:schemaRef ds:uri="http://schemas.microsoft.com/sharepoint/v3/contenttype/forms"/>
-  </ds:schemaRefs>
-</ds:datastoreItem>
-</file>
-
-<file path=customXml/itemProps3.xml><?xml version="1.0" encoding="utf-8"?>
-<ds:datastoreItem xmlns:ds="http://schemas.openxmlformats.org/officeDocument/2006/customXml" ds:itemID="{41D49AF8-9F7B-460E-A6AE-E1703074752B}">
-  <ds:schemaRefs>
-    <ds:schemaRef ds:uri="http://schemas.microsoft.com/office/2006/metadata/properties"/>
-    <ds:schemaRef ds:uri="http://schemas.microsoft.com/office/infopath/2007/PartnerControls"/>
-    <ds:schemaRef ds:uri="0671de82-fb77-4741-a946-bbedde5d4f76"/>
-    <ds:schemaRef ds:uri="bfe36008-4467-4f6a-b17f-684c3d9d556d"/>
-  </ds:schemaRefs>
-</ds:datastoreItem>
-</file>
-
-<file path=customXml/itemProps4.xml><?xml version="1.0" encoding="utf-8"?>
-<ds:datastoreItem xmlns:ds="http://schemas.openxmlformats.org/officeDocument/2006/customXml" ds:itemID="{11111111-1234-1234-1234-123412341234}">
-  <ds:schemaRefs>
-    <ds:schemaRef ds:uri="http://customooxmlschemas.google.com/"/>
-    <ds:schemaRef ds:uri="http://schemas.openxmlformats.org/officeDocument/2006/relationships"/>
-  </ds:schemaRefs>
-</ds:datastoreItem>
 </file>
</xml_diff>